<commit_message>
Regenerate the configuration-course workbooks from the corrected content
scripts/sync-workbooks.py updates each DOCX in place from the course data
(proved by a clean round trip against the previous content), sets document
properties and logo alt text, and the PDFs are re-exported as tagged PDFs.
All 11 workbooks match their new editions; tiered-admin is now 17 pages.

Co-Authored-By: Claude Opus 5.5 <noreply@anthropic.com>
Claude-Session: https://claude.ai/code/session_019wopQQuPwG5CcFGYaGF73Y
</commit_message>
<xml_diff>
--- a/public/training/business-services/SecureByDesign-business-services-Workbook.docx
+++ b/public/training/business-services/SecureByDesign-business-services-Workbook.docx
@@ -11,7 +11,7 @@
           <wp:inline distT="0" distB="0" distL="0" distR="0">
             <wp:extent cx="495300" cy="495300"/>
             <wp:effectExtent t="0" r="0" b="0" l="0"/>
-            <wp:docPr id="1" name="" descr="" title=""/>
+            <wp:docPr id="1" name="" descr="Secure By Design logo" title=""/>
             <wp:cNvGraphicFramePr>
               <a:graphicFrameLocks xmlns:a="http://schemas.openxmlformats.org/drawingml/2006/main" noChangeAspect="1"/>
             </wp:cNvGraphicFramePr>
@@ -19,7 +19,7 @@
               <a:graphicData uri="http://schemas.openxmlformats.org/drawingml/2006/picture">
                 <pic:pic xmlns:pic="http://schemas.openxmlformats.org/drawingml/2006/picture">
                   <pic:nvPicPr>
-                    <pic:cNvPr id="0" name="" descr=""/>
+                    <pic:cNvPr id="0" name="" descr="Secure By Design logo"/>
                     <pic:cNvPicPr>
                       <a:picLocks noChangeAspect="1" noChangeArrowheads="1"/>
                     </pic:cNvPicPr>
@@ -136,7 +136,7 @@
           <w:sz w:val="21"/>
           <w:szCs w:val="21"/>
         </w:rPr>
-        <w:t xml:space="preserve">Give the users what the network exists for: SBD-FS01's role-based shares over verified SMB security, SBD-SQL01 running as a managed identity behind exactly two callers, SBD-APPS01's licensing service, and SBD-WEB01 serving internal HTTPS from a hardened Apache — every hop a documented, proven register row.</w:t>
+        <w:t xml:space="preserve">Give the users what the network exists for: SBD-FS01's role-based shares over verified SMB security, SBD-WEB01 serving internal HTTPS from a hardened, domain-joined Linux Apache, SBD-APPS01's licensing service and application API, and SBD-SQL01 running as a managed identity behind exactly one caller — every hop a documented, proven register row.</w:t>
       </w:r>
     </w:p>
     <w:p>
@@ -150,7 +150,7 @@
           <w:sz w:val="16"/>
           <w:szCs w:val="16"/>
         </w:rPr>
-        <w:t xml:space="preserve">MATERIALS EDITION 1.0    /    COURSE 1.11</w:t>
+        <w:t xml:space="preserve">MATERIALS EDITION 1.1    /    COURSE 1.11</w:t>
       </w:r>
     </w:p>
     <w:p>
@@ -164,7 +164,7 @@
           <w:sz w:val="16"/>
           <w:szCs w:val="16"/>
         </w:rPr>
-        <w:t xml:space="preserve">Updated 7 October 2026  ·  sbd-business-services</w:t>
+        <w:t xml:space="preserve">Updated 8 October 2026  ·  sbd-business-services</w:t>
       </w:r>
     </w:p>
     <w:p>
@@ -327,7 +327,7 @@
             <w:sz w:val="21"/>
             <w:szCs w:val="21"/>
           </w:rPr>
-          <w:t xml:space="preserve">05  Reconcile, scan, and close the wave</w:t>
+          <w:t xml:space="preserve">05  Reconcile, scan, and hand off</w:t>
         </w:r>
       </w:hyperlink>
     </w:p>
@@ -428,7 +428,7 @@
           <w:sz w:val="21"/>
           <w:szCs w:val="21"/>
         </w:rPr>
-        <w:t xml:space="preserve">The users finally get what the network exists for: files, a database, licensing, and an internal web service. The model's rule governs the whole wave — permit only documented business service paths — so every service arrives with its register rows, its service identity, and its certificate, and nothing reaches it any other way.</w:t>
+        <w:t xml:space="preserve">The users finally get what the network exists for: files, licensing, and an internal web application with its application tier and database. The model's rule governs the whole course — permit only documented business service paths — so every service arrives with its register rows, its service identity, and its certificate, and nothing reaches it any other way.</w:t>
       </w:r>
     </w:p>
     <w:p>
@@ -484,7 +484,7 @@
           <w:sz w:val="21"/>
           <w:szCs w:val="21"/>
         </w:rPr>
-        <w:t xml:space="preserve">Provision the VLAN 40 hosts: SBD-FS01 (10.0.40.10), SBD-SQL01 (10.0.40.20), SBD-APPS01 (10.0.40.30), and SBD-WEB01 (10.0.40.40, Linux with Apache).</w:t>
+        <w:t xml:space="preserve">Provision the VLAN 40 hosts: SBD-FS01 (10.0.40.10), SBD-SQL01 (10.0.40.20), SBD-APPS01 (10.0.40.30), and SBD-WEB01 (10.0.40.40, Linux with Apache, joined to the sbd.test domain with SSSD like SBD-SPLUNK01 and SBD-NESSUS01).</w:t>
       </w:r>
     </w:p>
     <w:p>
@@ -559,7 +559,7 @@
           <w:sz w:val="21"/>
           <w:szCs w:val="21"/>
         </w:rPr>
-        <w:t xml:space="preserve">Run the database as a managed identity, certificate-encrypted, behind its two applications.</w:t>
+        <w:t xml:space="preserve">Run the database as a managed identity, certificate-encrypted, with SBD-APPS01 as its only caller.</w:t>
       </w:r>
     </w:p>
     <w:p>
@@ -578,7 +578,7 @@
           <w:sz w:val="21"/>
           <w:szCs w:val="21"/>
         </w:rPr>
-        <w:t xml:space="preserve">Prove the fleet → web → database chain with every hop registered and every shortcut denied.</w:t>
+        <w:t xml:space="preserve">Prove the fleet → web → application → database chain with every hop registered and every shortcut denied.</w:t>
       </w:r>
     </w:p>
     <w:p>
@@ -971,7 +971,7 @@
           <w:sz w:val="16"/>
           <w:szCs w:val="16"/>
         </w:rPr>
-        <w:t xml:space="preserve">LESSON 01  /  ABOUT 25 MIN</w:t>
+        <w:t xml:space="preserve">LESSON 01  /  ABOUT 30 MIN</w:t>
       </w:r>
     </w:p>
     <w:p>
@@ -1132,7 +1132,7 @@
           <w:sz w:val="21"/>
           <w:szCs w:val="21"/>
         </w:rPr>
-        <w:t xml:space="preserve">Write the service-path rows: fleet to FS01 (SMB 445), fleet to APPS01 (its licensing port) and WEB01 (HTTPS 443), WEB01 and APPS01 — and only they — to SQL01 (1433). Everything else toward VLAN 40 stays denied, including endpoint-to-SQL directly.</w:t>
+        <w:t xml:space="preserve">Write the service-path rows: fleet to FS01 (SMB 445); fleet to APPS01 on its licensing port, recorded per application; fleet to WEB01 (HTTPS 443); WEB01 to APPS01 for the application API (HTTPS 443); and APPS01 — and only APPS01 — to SQL01 (TCP 1433 with TLS). Add an explicit deny from WEB01 to SQL01: the web tier has no database dependency. All four servers share VLAN 40, so the router never sees their traffic to each other — each server's host firewall enforces those rows. Everything else toward VLAN 40 stays denied, including endpoint-to-SQL directly.</w:t>
       </w:r>
     </w:p>
     <w:p>
@@ -1151,7 +1151,7 @@
           <w:sz w:val="21"/>
           <w:szCs w:val="21"/>
         </w:rPr>
-        <w:t xml:space="preserve">Choose the service identities: group managed service accounts for the SQL and application services, so passwords rotate themselves — and note Windows Server 2025's delegated managed service accounts as the migration path for any legacy service account this lab later inherits.</w:t>
+        <w:t xml:space="preserve">Register WEB01's Linux maintenance rows as well: packages from SBD-REPO01 only (HTTP with GPG-signed packages) and syslog over TLS to the collector, SBD-SYSLOG01 (TCP 6514) — the same paths the other domain-joined Linux servers, SBD-SPLUNK01 and SBD-NESSUS01, use. Course 1.10's repository row named only those two because WEB01 did not exist yet.</w:t>
       </w:r>
     </w:p>
     <w:p>
@@ -1170,7 +1170,7 @@
           <w:sz w:val="21"/>
           <w:szCs w:val="21"/>
         </w:rPr>
-        <w:t xml:space="preserve">Create the access groups under the course 1.3 Groups OU — per-share and per-application role groups — because permissions will be granted to roles, never to named humans.</w:t>
+        <w:t xml:space="preserve">Choose the service identities: group managed service accounts (gMSAs) for the SQL and application services, so passwords rotate themselves — and note Windows Server 2025's delegated managed service accounts as the migration path for any legacy service account this lab later inherits.</w:t>
       </w:r>
     </w:p>
     <w:p>
@@ -1189,7 +1189,26 @@
           <w:sz w:val="21"/>
           <w:szCs w:val="21"/>
         </w:rPr>
-        <w:t xml:space="preserve">Request the server certificates through the course 1.6 process: one SBD Server Authentication certificate each for SQL01 and WEB01, enrolled from the template, with the publication site serving their revocation story.</w:t>
+        <w:t xml:space="preserve">Create the access groups under the course 1.3 Groups OU — per-share and per-application role groups — because permissions will be granted to roles, never to named humans.</w:t>
+      </w:r>
+    </w:p>
+    <w:p>
+      <w:pPr>
+        <w:pStyle w:val="ListParagraph"/>
+        <w:numPr>
+          <w:ilvl w:val="0"/>
+          <w:numId w:val="4"/>
+        </w:numPr>
+        <w:spacing w:after="120" w:before="0" w:line="288" w:lineRule="auto"/>
+      </w:pPr>
+      <w:r>
+        <w:rPr>
+          <w:rFonts w:ascii="Arial" w:cs="Arial" w:eastAsia="Arial" w:hAnsi="Arial"/>
+          <w:color w:val="526B7E"/>
+          <w:sz w:val="21"/>
+          <w:szCs w:val="21"/>
+        </w:rPr>
+        <w:t xml:space="preserve">Request the server certificates through the course 1.6 process: one SBD Server Authentication certificate each for SQL01, APPS01 (for its application API), and WEB01, enrolled from the template, with the publication site serving their revocation story.</w:t>
       </w:r>
     </w:p>
     <w:p>
@@ -1285,7 +1304,7 @@
           <w:sz w:val="20"/>
           <w:szCs w:val="20"/>
         </w:rPr>
-        <w:t xml:space="preserve">The register carries the four services' rows with the SQL path restricted to its two callers, the gMSAs and role groups exist, and both server certificates are issued and recorded.</w:t>
+        <w:t xml:space="preserve">The register carries every service row — the SQL path restricted to APPS01 alone, the WEB01-to-SQL01 deny, and WEB01's repository and syslog rows — the gMSAs and role groups exist, and the three server certificates are issued and recorded.</w:t>
       </w:r>
     </w:p>
     <w:p>
@@ -1864,7 +1883,7 @@
           <w:sz w:val="20"/>
           <w:szCs w:val="20"/>
         </w:rPr>
-        <w:t xml:space="preserve">Every path is a row; the database hears only its applications.  Service identities are managed accounts, not passwords.  Access belongs to roles; certificates are already in hand.</w:t>
+        <w:t xml:space="preserve">Every path is a row; the database hears only SBD-APPS01.  Service identities are managed accounts, not passwords.  Access belongs to roles; certificates are already in hand.</w:t>
       </w:r>
     </w:p>
     <w:p>
@@ -1985,7 +2004,7 @@
           <w:sz w:val="20"/>
           <w:szCs w:val="20"/>
         </w:rPr>
-        <w:t xml:space="preserve">The file server is where access control meets daily life. Build the shares against the role groups, lean on the SMB security the platform now enforces, and make 'who can read this' a one-lookup question.</w:t>
+        <w:t xml:space="preserve">The file server is where access control meets daily life. Build the shares against the role groups, require SMB signing on the server instead of trusting client defaults, and make 'who can read this' a one-lookup question.</w:t>
       </w:r>
     </w:p>
     <w:p>
@@ -2097,7 +2116,7 @@
           <w:sz w:val="21"/>
           <w:szCs w:val="21"/>
         </w:rPr>
-        <w:t xml:space="preserve">Build SBD-FS01 in the Servers OU and create the planned shares, granting NTFS permissions to the lesson-1 role groups only — share permissions stay simple, the filesystem carries the detail, and no named human appears in an ACL.</w:t>
+        <w:t xml:space="preserve">Build SBD-FS01 in the Servers OU and create the planned shares, granting NTFS permissions to the lesson-1 role groups only — share permissions stay simple, the filesystem carries the detail, and no named human appears in an access control list (ACL).</w:t>
       </w:r>
     </w:p>
     <w:p>
@@ -2135,7 +2154,7 @@
           <w:sz w:val="21"/>
           <w:szCs w:val="21"/>
         </w:rPr>
-        <w:t xml:space="preserve">Confirm the SMB posture: Windows Server 2025 and the Windows 11 fleet already require signing by default, and this share design opts into SMB encryption for the sensitive share — verify both on a live session rather than assuming the default.</w:t>
+        <w:t xml:space="preserve">Confirm the SMB posture. Windows 11 version 24H2 Pro, Enterprise, and Education require SMB signing for both inbound and outbound connections, but Windows Server 2025 requires it only for its own outbound connections — so require signing on SBD-FS01 as well (RequireSecuritySignature in its SMB server configuration), and opt the sensitive share into SMB encryption. Verify both on a live connection from a fleet machine rather than assuming the defaults.</w:t>
       </w:r>
     </w:p>
     <w:p>
@@ -2188,7 +2207,7 @@
           <w:sz w:val="18"/>
           <w:szCs w:val="18"/>
         </w:rPr>
-        <w:t xml:space="preserve">Get-SmbShare | Select-Object Name, Path, FolderEnumerationMode</w:t>
+        <w:t xml:space="preserve">Get-SmbShare | Select-Object Name, Path, FolderEnumerationMode, EncryptData   # on FS01</w:t>
       </w:r>
     </w:p>
     <w:p>
@@ -2204,7 +2223,23 @@
           <w:sz w:val="18"/>
           <w:szCs w:val="18"/>
         </w:rPr>
-        <w:t xml:space="preserve">Get-SmbSession | Select-Object ClientComputerName, Signed, Encrypted   # run during the test session, on FS01</w:t>
+        <w:t xml:space="preserve">Get-SmbServerConfiguration | Select-Object RequireSecuritySignature   # on FS01: expected True</w:t>
+      </w:r>
+    </w:p>
+    <w:p>
+      <w:pPr>
+        <w:shd w:fill="F1F7FA" w:color="auto" w:val="clear"/>
+        <w:spacing w:after="0" w:before="0" w:line="252" w:lineRule="auto"/>
+        <w:ind w:left="160" w:right="160"/>
+      </w:pPr>
+      <w:r>
+        <w:rPr>
+          <w:rFonts w:ascii="Consolas" w:cs="Consolas" w:eastAsia="Consolas" w:hAnsi="Consolas"/>
+          <w:color w:val="193448"/>
+          <w:sz w:val="18"/>
+          <w:szCs w:val="18"/>
+        </w:rPr>
+        <w:t xml:space="preserve">Get-SmbConnection -ServerName SBD-FS01 | Select-Object ShareName, Dialect, Signed, Encrypted   # on the fleet machine, during the test session</w:t>
       </w:r>
     </w:p>
     <w:p>
@@ -2250,7 +2285,7 @@
           <w:sz w:val="20"/>
           <w:szCs w:val="20"/>
         </w:rPr>
-        <w:t xml:space="preserve">Shares grant to role groups only, a live session shows signing (and encryption where designed), and the two-role test proves both the access and the invisible-denied behavior.</w:t>
+        <w:t xml:space="preserve">Shares grant to role groups only, FS01 requires signing, a live connection from the fleet shows Signed True — or, on the encrypted share, Encrypted True, where Signed reads False even though an encrypted connection is also signed — and the two-role test proves both the access and the invisible-denied behavior.</w:t>
       </w:r>
     </w:p>
     <w:p>
@@ -2282,7 +2317,7 @@
           <w:sz w:val="21"/>
           <w:szCs w:val="21"/>
         </w:rPr>
-        <w:t xml:space="preserve">Evidence to keep: Keep the share and NTFS permission reports, the live session's signing/encryption output, and the two-role test record with its pipeline entry.</w:t>
+        <w:t xml:space="preserve">Evidence to keep: Keep the share and NTFS permission reports, FS01's signing setting and the live connection's signing/encryption output, and the two-role test record with its pipeline entry.</w:t>
       </w:r>
     </w:p>
     <w:tbl>
@@ -2829,7 +2864,7 @@
           <w:sz w:val="20"/>
           <w:szCs w:val="20"/>
         </w:rPr>
-        <w:t xml:space="preserve">Roles own the ACLs; humans own role memberships.  Signing and encryption are verified on a live session.  Both the access and the denial are on record.</w:t>
+        <w:t xml:space="preserve">Roles own the ACLs; humans own role memberships.  Signing and encryption are verified on a live connection.  Both the access and the denial are on record.</w:t>
       </w:r>
     </w:p>
     <w:p>
@@ -2853,6 +2888,57 @@
       <w:pPr>
         <w:spacing w:after="60" w:before="0" w:line="288" w:lineRule="auto"/>
       </w:pPr>
+      <w:hyperlink w:history="1" r:id="rId9">
+        <w:r>
+          <w:rPr>
+            <w:rFonts w:ascii="Arial" w:cs="Arial" w:eastAsia="Arial" w:hAnsi="Arial"/>
+            <w:color w:val="20647C"/>
+            <w:sz w:val="18"/>
+            <w:szCs w:val="18"/>
+            <w:u w:val="single"/>
+          </w:rPr>
+          <w:t xml:space="preserve">Microsoft · SMB signing</w:t>
+        </w:r>
+      </w:hyperlink>
+    </w:p>
+    <w:p>
+      <w:pPr>
+        <w:spacing w:after="60" w:before="0" w:line="288" w:lineRule="auto"/>
+      </w:pPr>
+      <w:hyperlink w:history="1" r:id="rId10">
+        <w:r>
+          <w:rPr>
+            <w:rFonts w:ascii="Arial" w:cs="Arial" w:eastAsia="Arial" w:hAnsi="Arial"/>
+            <w:color w:val="20647C"/>
+            <w:sz w:val="18"/>
+            <w:szCs w:val="18"/>
+            <w:u w:val="single"/>
+          </w:rPr>
+          <w:t xml:space="preserve">Microsoft · Get-SmbConnection</w:t>
+        </w:r>
+      </w:hyperlink>
+    </w:p>
+    <w:p>
+      <w:pPr>
+        <w:spacing w:after="60" w:before="0" w:line="288" w:lineRule="auto"/>
+      </w:pPr>
+      <w:hyperlink w:history="1" r:id="rId11">
+        <w:r>
+          <w:rPr>
+            <w:rFonts w:ascii="Arial" w:cs="Arial" w:eastAsia="Arial" w:hAnsi="Arial"/>
+            <w:color w:val="20647C"/>
+            <w:sz w:val="18"/>
+            <w:szCs w:val="18"/>
+            <w:u w:val="single"/>
+          </w:rPr>
+          <w:t xml:space="preserve">Microsoft · MSFT_SmbConnection class (Signed and Encrypted)</w:t>
+        </w:r>
+      </w:hyperlink>
+    </w:p>
+    <w:p>
+      <w:pPr>
+        <w:spacing w:after="60" w:before="0" w:line="288" w:lineRule="auto"/>
+      </w:pPr>
       <w:hyperlink w:history="1" r:id="rIdfk9e0tqq3w_ydyxii1d-h">
         <w:r>
           <w:rPr>
@@ -2933,7 +3019,7 @@
           <w:sz w:val="20"/>
           <w:szCs w:val="20"/>
         </w:rPr>
-        <w:t xml:space="preserve">The database runs as a managed identity, encrypts its connections with a real certificate, and answers exactly two callers — the narrowest audience on the network, by design.</w:t>
+        <w:t xml:space="preserve">The database runs as a managed identity, encrypts its connections with a real certificate, and answers exactly one caller, SBD-APPS01 — the narrowest audience on the network, by design.</w:t>
       </w:r>
     </w:p>
     <w:p>
@@ -3008,7 +3094,7 @@
           <w:sz w:val="21"/>
           <w:szCs w:val="21"/>
         </w:rPr>
-        <w:t xml:space="preserve">Prove the two-caller rule: applications connect, everything else is refused.</w:t>
+        <w:t xml:space="preserve">Prove the one-caller rule: SBD-APPS01 connects; SBD-WEB01 and the fleet are refused.</w:t>
       </w:r>
     </w:p>
     <w:p>
@@ -3083,7 +3169,7 @@
           <w:sz w:val="21"/>
           <w:szCs w:val="21"/>
         </w:rPr>
-        <w:t xml:space="preserve">Create the application databases with role-based database access for the WEB01 and APPS01 identities — least privilege continues inside the engine, not just at its port.</w:t>
+        <w:t xml:space="preserve">Create the application databases with role-based database access for the APPS01 application identity only — least privilege continues inside the engine, not just at its port.</w:t>
       </w:r>
     </w:p>
     <w:p>
@@ -3102,7 +3188,7 @@
           <w:sz w:val="21"/>
           <w:szCs w:val="21"/>
         </w:rPr>
-        <w:t xml:space="preserve">Prove the audience: a connection from WEB01 succeeds encrypted; the same attempt from a fleet machine dies at the boundary with a deny-log entry — the register row, demonstrated from both sides.</w:t>
+        <w:t xml:space="preserve">Prove the audience: a connection from APPS01 succeeds encrypted. The same attempt from SBD-WEB01 is refused by SBD-SQL01's host firewall — the two share VLAN 40, so the router never sees it — and one from a fleet machine dies at the router with a deny-log entry. Turn on the host firewall's dropped-packet logging if it is off, so both refusals leave a record.</w:t>
       </w:r>
     </w:p>
     <w:p>
@@ -3152,7 +3238,7 @@
           <w:sz w:val="18"/>
           <w:szCs w:val="18"/>
         </w:rPr>
-        <w:t xml:space="preserve"># From SBD-WEB01: the registered caller connects. From a fleet machine:</w:t>
+        <w:t xml:space="preserve"># From SBD-APPS01, the registered caller: expected TcpTestSucceeded True.</w:t>
       </w:r>
     </w:p>
     <w:p>
@@ -3168,7 +3254,71 @@
           <w:sz w:val="18"/>
           <w:szCs w:val="18"/>
         </w:rPr>
-        <w:t xml:space="preserve">Test-NetConnection SBD-SQL01.sbd.test -Port 1433   # expected from fleet: TcpTestSucceeded False</w:t>
+        <w:t xml:space="preserve">Test-NetConnection SBD-SQL01.sbd.test -Port 1433</w:t>
+      </w:r>
+    </w:p>
+    <w:p>
+      <w:pPr>
+        <w:shd w:fill="F1F7FA" w:color="auto" w:val="clear"/>
+        <w:spacing w:after="0" w:before="0" w:line="252" w:lineRule="auto"/>
+        <w:ind w:left="160" w:right="160"/>
+      </w:pPr>
+      <w:r>
+        <w:rPr>
+          <w:rFonts w:ascii="Consolas" w:cs="Consolas" w:eastAsia="Consolas" w:hAnsi="Consolas"/>
+          <w:color w:val="193448"/>
+          <w:sz w:val="18"/>
+          <w:szCs w:val="18"/>
+        </w:rPr>
+        <w:t xml:space="preserve"># From a fleet machine: expected TcpTestSucceeded False.</w:t>
+      </w:r>
+    </w:p>
+    <w:p>
+      <w:pPr>
+        <w:shd w:fill="F1F7FA" w:color="auto" w:val="clear"/>
+        <w:spacing w:after="0" w:before="0" w:line="252" w:lineRule="auto"/>
+        <w:ind w:left="160" w:right="160"/>
+      </w:pPr>
+      <w:r>
+        <w:rPr>
+          <w:rFonts w:ascii="Consolas" w:cs="Consolas" w:eastAsia="Consolas" w:hAnsi="Consolas"/>
+          <w:color w:val="193448"/>
+          <w:sz w:val="18"/>
+          <w:szCs w:val="18"/>
+        </w:rPr>
+        <w:t xml:space="preserve">Test-NetConnection SBD-SQL01.sbd.test -Port 1433</w:t>
+      </w:r>
+    </w:p>
+    <w:p>
+      <w:pPr>
+        <w:shd w:fill="F1F7FA" w:color="auto" w:val="clear"/>
+        <w:spacing w:after="0" w:before="0" w:line="252" w:lineRule="auto"/>
+        <w:ind w:left="160" w:right="160"/>
+      </w:pPr>
+      <w:r>
+        <w:rPr>
+          <w:rFonts w:ascii="Consolas" w:cs="Consolas" w:eastAsia="Consolas" w:hAnsi="Consolas"/>
+          <w:color w:val="193448"/>
+          <w:sz w:val="18"/>
+          <w:szCs w:val="18"/>
+        </w:rPr>
+        <w:t xml:space="preserve"># From SBD-WEB01 (Linux): expected to be refused or time out.</w:t>
+      </w:r>
+    </w:p>
+    <w:p>
+      <w:pPr>
+        <w:shd w:fill="F1F7FA" w:color="auto" w:val="clear"/>
+        <w:spacing w:after="0" w:before="0" w:line="252" w:lineRule="auto"/>
+        <w:ind w:left="160" w:right="160"/>
+      </w:pPr>
+      <w:r>
+        <w:rPr>
+          <w:rFonts w:ascii="Consolas" w:cs="Consolas" w:eastAsia="Consolas" w:hAnsi="Consolas"/>
+          <w:color w:val="193448"/>
+          <w:sz w:val="18"/>
+          <w:szCs w:val="18"/>
+        </w:rPr>
+        <w:t xml:space="preserve">nc -zv SBD-SQL01.sbd.test 1433</w:t>
       </w:r>
     </w:p>
     <w:p>
@@ -3214,7 +3364,7 @@
           <w:sz w:val="20"/>
           <w:szCs w:val="20"/>
         </w:rPr>
-        <w:t xml:space="preserve">The service runs as the gMSA, connections are certificate-encrypted with a validating chain, application access works by database role, and the fleet's direct attempt fails with its logged deny.</w:t>
+        <w:t xml:space="preserve">The service runs as the gMSA, connections are certificate-encrypted with a validating chain, APPS01's access works by database role, and both direct attempts fail with a record: SBD-WEB01's at SQL01's host firewall, the fleet's at the router.</w:t>
       </w:r>
     </w:p>
     <w:p>
@@ -3246,7 +3396,7 @@
           <w:sz w:val="21"/>
           <w:szCs w:val="21"/>
         </w:rPr>
-        <w:t xml:space="preserve">Evidence to keep: Keep the service identity proof, the certificate binding and urlfetch output, the database role grants, and the paired success/deny connection evidence.</w:t>
+        <w:t xml:space="preserve">Evidence to keep: Keep the service identity proof, the certificate binding and urlfetch output, the database role grants, and APPS01's successful connection paired with both refusals and their log entries.</w:t>
       </w:r>
     </w:p>
     <w:tbl>
@@ -3793,7 +3943,7 @@
           <w:sz w:val="20"/>
           <w:szCs w:val="20"/>
         </w:rPr>
-        <w:t xml:space="preserve">A managed identity runs the engine; no password exists to leak.  Connections encrypt under the lab's own validated chain.  Two callers in, everyone else logged out at the boundary.</w:t>
+        <w:t xml:space="preserve">A managed identity runs the engine; no password exists to leak.  Connections encrypt under the lab's own validated chain.  One caller in: SBD-APPS01. SBD-WEB01 is refused at SQL01's host firewall and the fleet at the router.</w:t>
       </w:r>
     </w:p>
     <w:p>
@@ -3848,7 +3998,7 @@
           <w:sz w:val="16"/>
           <w:szCs w:val="16"/>
         </w:rPr>
-        <w:t xml:space="preserve">LESSON 04  /  ABOUT 35 MIN</w:t>
+        <w:t xml:space="preserve">LESSON 04  /  ABOUT 40 MIN</w:t>
       </w:r>
     </w:p>
     <w:p>
@@ -3897,7 +4047,7 @@
           <w:sz w:val="20"/>
           <w:szCs w:val="20"/>
         </w:rPr>
-        <w:t xml:space="preserve">The licensing service and the internal web server complete the dependency chain: fleet to application, application to database — each hop registered, the web tier hardened against its DISA guidance, and HTTPS served from the lab's own trust.</w:t>
+        <w:t xml:space="preserve">The application server and the internal web server complete the dependency chain: fleet to web, web to application, application to database — each hop a register row, the web tier hardened against its Defense Information Systems Agency (DISA) guidance, and HTTPS served from the lab's own trust.</w:t>
       </w:r>
     </w:p>
     <w:p>
@@ -3934,7 +4084,7 @@
           <w:sz w:val="21"/>
           <w:szCs w:val="21"/>
         </w:rPr>
-        <w:t xml:space="preserve">Stand up the licensing service with its registered fleet path.</w:t>
+        <w:t xml:space="preserve">Stand up SBD-APPS01's licensing service and application API on their registered paths.</w:t>
       </w:r>
     </w:p>
     <w:p>
@@ -3953,7 +4103,7 @@
           <w:sz w:val="21"/>
           <w:szCs w:val="21"/>
         </w:rPr>
-        <w:t xml:space="preserve">Build the Apache server hardened per its STIG guidance, serving HTTPS with the internal certificate.</w:t>
+        <w:t xml:space="preserve">Build the domain-joined Linux Apache server hardened per its DISA Security Technical Implementation Guide (STIG), serving HTTPS with the internal certificate.</w:t>
       </w:r>
     </w:p>
     <w:p>
@@ -3972,7 +4122,7 @@
           <w:sz w:val="21"/>
           <w:szCs w:val="21"/>
         </w:rPr>
-        <w:t xml:space="preserve">Prove the full chain: fleet → web → database.</w:t>
+        <w:t xml:space="preserve">Prove the full chain: fleet → web → application → database, with the web-to-database shortcut refused.</w:t>
       </w:r>
     </w:p>
     <w:p>
@@ -4009,7 +4159,7 @@
           <w:sz w:val="21"/>
           <w:szCs w:val="21"/>
         </w:rPr>
-        <w:t xml:space="preserve">Build SBD-APPS01 in the Servers OU, run its licensing service under a managed identity, and verify the fleet path on the registered port — the smallest of the four services, and the template for any future one: identity, row, evidence.</w:t>
+        <w:t xml:space="preserve">Build SBD-APPS01 in the Servers OU and run both of its services under managed identities: the licensing service, verified from the fleet on its registered vendor port, and the application API on HTTPS 443 with its SBD Server Authentication certificate, answering SBD-WEB01 only. APPS01 is the network's one SQL consumer — and the template for any future service: identity, row, evidence.</w:t>
       </w:r>
     </w:p>
     <w:p>
@@ -4028,7 +4178,7 @@
           <w:sz w:val="21"/>
           <w:szCs w:val="21"/>
         </w:rPr>
-        <w:t xml:space="preserve">Build SBD-WEB01 on the Linux platform, packages from SBD-REPO01 only, and harden the web tier against DISA's Apache guidance — the server's assessable record follows the Linux pattern: hardened configuration exported and hashed, checklist items answered in STIG Viewer.</w:t>
+        <w:t xml:space="preserve">Build SBD-WEB01 on Linux and join it to the sbd.test domain with SSSD, as SBD-SPLUNK01 and SBD-NESSUS01 are joined. Point its packages at SBD-REPO01 only, its syslog over TLS at the collector, and its time service at both domain controllers, and harden the web tier against DISA's Apache guidance — the server's assessable record follows the Linux pattern: hardened configuration exported and hashed, checklist items answered in STIG Viewer.</w:t>
       </w:r>
     </w:p>
     <w:p>
@@ -4047,7 +4197,7 @@
           <w:sz w:val="21"/>
           <w:szCs w:val="21"/>
         </w:rPr>
-        <w:t xml:space="preserve">Install the SBD Server Authentication certificate with its chain and serve the internal application over HTTPS — the 2,048-bit floor from the accuracy review applies here as everywhere.</w:t>
+        <w:t xml:space="preserve">Install the SBD Server Authentication certificate with its chain and serve the internal application over HTTPS — the 2,048-bit key floor from course 1.6's templates applies here as everywhere.</w:t>
       </w:r>
     </w:p>
     <w:p>
@@ -4066,7 +4216,7 @@
           <w:sz w:val="21"/>
           <w:szCs w:val="21"/>
         </w:rPr>
-        <w:t xml:space="preserve">Prove the chain from a fleet machine: the HTTPS page loads with a validating certificate, the page's data round-trips through SQL01, and the fleet still cannot touch 1433 directly — three courses of design visible in one browser request.</w:t>
+        <w:t xml:space="preserve">Prove the chain from a fleet machine: the HTTPS page loads with a validating certificate, and its data travels fleet → WEB01 → APPS01 → SQL01, every hop a register row. Then prove the shortcuts stay shut: a direct attempt from SBD-WEB01 to SQL01 on 1433 is refused by SQL01's host firewall, and the fleet still cannot touch 1433 at all — three courses of design visible in one browser request.</w:t>
       </w:r>
     </w:p>
     <w:p>
@@ -4100,7 +4250,7 @@
           <w:sz w:val="18"/>
           <w:szCs w:val="18"/>
         </w:rPr>
-        <w:t xml:space="preserve">Test-NetConnection SBD-WEB01.sbd.test -Port 443</w:t>
+        <w:t xml:space="preserve">Test-NetConnection SBD-WEB01.sbd.test -Port 443   # from a fleet machine</w:t>
       </w:r>
     </w:p>
     <w:p>
@@ -4116,7 +4266,7 @@
           <w:sz w:val="18"/>
           <w:szCs w:val="18"/>
         </w:rPr>
-        <w:t xml:space="preserve"># From a fleet machine, trust and chain:</w:t>
+        <w:t xml:space="preserve">certutil -verify -urlfetch C:\Evidence\services\web01.cer</w:t>
       </w:r>
     </w:p>
     <w:p>
@@ -4132,7 +4282,55 @@
           <w:sz w:val="18"/>
           <w:szCs w:val="18"/>
         </w:rPr>
-        <w:t xml:space="preserve">certutil -verify -urlfetch C:\Evidence\services\web01.cer</w:t>
+        <w:t xml:space="preserve">Test-NetConnection SBD-SQL01.sbd.test -Port 1433   # from the fleet: expected False</w:t>
+      </w:r>
+    </w:p>
+    <w:p>
+      <w:pPr>
+        <w:shd w:fill="F1F7FA" w:color="auto" w:val="clear"/>
+        <w:spacing w:after="0" w:before="0" w:line="252" w:lineRule="auto"/>
+        <w:ind w:left="160" w:right="160"/>
+      </w:pPr>
+      <w:r>
+        <w:rPr>
+          <w:rFonts w:ascii="Consolas" w:cs="Consolas" w:eastAsia="Consolas" w:hAnsi="Consolas"/>
+          <w:color w:val="193448"/>
+          <w:sz w:val="18"/>
+          <w:szCs w:val="18"/>
+        </w:rPr>
+        <w:t xml:space="preserve"># On SBD-WEB01 (Linux): domain membership, the API answers, the database does not.</w:t>
+      </w:r>
+    </w:p>
+    <w:p>
+      <w:pPr>
+        <w:shd w:fill="F1F7FA" w:color="auto" w:val="clear"/>
+        <w:spacing w:after="0" w:before="0" w:line="252" w:lineRule="auto"/>
+        <w:ind w:left="160" w:right="160"/>
+      </w:pPr>
+      <w:r>
+        <w:rPr>
+          <w:rFonts w:ascii="Consolas" w:cs="Consolas" w:eastAsia="Consolas" w:hAnsi="Consolas"/>
+          <w:color w:val="193448"/>
+          <w:sz w:val="18"/>
+          <w:szCs w:val="18"/>
+        </w:rPr>
+        <w:t xml:space="preserve">realm list</w:t>
+      </w:r>
+    </w:p>
+    <w:p>
+      <w:pPr>
+        <w:shd w:fill="F1F7FA" w:color="auto" w:val="clear"/>
+        <w:spacing w:after="0" w:before="0" w:line="252" w:lineRule="auto"/>
+        <w:ind w:left="160" w:right="160"/>
+      </w:pPr>
+      <w:r>
+        <w:rPr>
+          <w:rFonts w:ascii="Consolas" w:cs="Consolas" w:eastAsia="Consolas" w:hAnsi="Consolas"/>
+          <w:color w:val="193448"/>
+          <w:sz w:val="18"/>
+          <w:szCs w:val="18"/>
+        </w:rPr>
+        <w:t xml:space="preserve">curl -sS -o /dev/null -w '%{http_code}\n' https://SBD-APPS01.sbd.test/   # use your application's health path</w:t>
       </w:r>
     </w:p>
     <w:p>
@@ -4148,7 +4346,7 @@
           <w:sz w:val="18"/>
           <w:szCs w:val="18"/>
         </w:rPr>
-        <w:t xml:space="preserve">Test-NetConnection SBD-SQL01.sbd.test -Port 1433   # from fleet, still expected: False</w:t>
+        <w:t xml:space="preserve">nc -zv SBD-SQL01.sbd.test 1433   # expected: refused or timed out</w:t>
       </w:r>
     </w:p>
     <w:p>
@@ -4178,7 +4376,7 @@
           <w:sz w:val="20"/>
           <w:szCs w:val="20"/>
         </w:rPr>
-        <w:t xml:space="preserve">The licensing path works as registered, the Apache host serves HTTPS with a validating internal chain from a hardened, hashed configuration, and the end-to-end request proves fleet → web → database with the shortcut still denied.</w:t>
+        <w:t xml:space="preserve">The licensing path works as registered, SBD-WEB01 is domain-joined with SSSD and patches only from SBD-REPO01, the Apache host serves HTTPS with a validating internal chain from a hardened, hashed configuration, and the end-to-end request proves fleet → web → application → database with both shortcuts denied.</w:t>
       </w:r>
     </w:p>
     <w:p>
@@ -4210,7 +4408,7 @@
           <w:sz w:val="21"/>
           <w:szCs w:val="21"/>
         </w:rPr>
-        <w:t xml:space="preserve">Evidence to keep: Keep APPS01's identity and path proof, WEB01's hardened config export with hashes and checklist, the certificate validation output, and the end-to-end chain test.</w:t>
+        <w:t xml:space="preserve">Evidence to keep: Keep APPS01's identity and path proof, WEB01's domain-join and repository settings, its hardened config export with hashes and checklist, the certificate validation output, the end-to-end chain test, and the refused WEB01-to-SQL01 attempt.</w:t>
       </w:r>
     </w:p>
     <w:tbl>
@@ -4757,7 +4955,7 @@
           <w:sz w:val="20"/>
           <w:szCs w:val="20"/>
         </w:rPr>
-        <w:t xml:space="preserve">Two services, two identities, every hop a register row.  The web tier is hardened to its guidance and serves the lab's own trust.  One page load proves the dependency chain end to end.</w:t>
+        <w:t xml:space="preserve">APPS01 serves licensing and the application API; WEB01 joins the domain like the other Linux servers.  The web tier is hardened to its guidance and serves the lab's own trust.  One page load proves fleet → web → application → database; the shortcuts stay shut.</w:t>
       </w:r>
     </w:p>
     <w:p>
@@ -4847,7 +5045,7 @@
           <w:sz w:val="40"/>
           <w:szCs w:val="40"/>
         </w:rPr>
-        <w:t xml:space="preserve">Reconcile, scan, and close the wave</w:t>
+        <w:t xml:space="preserve">Reconcile, scan, and hand off</w:t>
       </w:r>
       <w:bookmarkEnd w:id="7"/>
     </w:p>
@@ -4878,7 +5076,7 @@
           <w:sz w:val="20"/>
           <w:szCs w:val="20"/>
         </w:rPr>
-        <w:t xml:space="preserve">The service wave closes the way every wave has: the register reconciled against live behavior, the new systems baselined, the inventory updated — and for the first time, the network is functionally complete.</w:t>
+        <w:t xml:space="preserve">The business services close the way every build course has: the register reconciled against live behavior, the new systems baselined, the inventory updated — and for the first time, the network is functionally complete.</w:t>
       </w:r>
     </w:p>
     <w:p>
@@ -4953,7 +5151,7 @@
           <w:sz w:val="21"/>
           <w:szCs w:val="21"/>
         </w:rPr>
-        <w:t xml:space="preserve">Update the living records and write the wave's handoff.</w:t>
+        <w:t xml:space="preserve">Update the living records and write the course's handoff.</w:t>
       </w:r>
     </w:p>
     <w:p>
@@ -4990,7 +5188,7 @@
           <w:sz w:val="21"/>
           <w:szCs w:val="21"/>
         </w:rPr>
-        <w:t xml:space="preserve">Run the full-register reconciliation one more time: every business-service row proven from its real source, every adjacent deny probed and logged — the VLAN 40 section of the matrix joins the evidence beside courses 1.5 and 1.7's.</w:t>
+        <w:t xml:space="preserve">Run the full-register reconciliation one more time: every business-service row proven from its real source, every adjacent deny probed and logged, including WEB01 to SQL01 — the VLAN 40 section of the matrix joins the evidence beside courses 1.5 and 1.7's.</w:t>
       </w:r>
     </w:p>
     <w:p>
@@ -5127,7 +5325,7 @@
           <w:sz w:val="20"/>
           <w:szCs w:val="20"/>
         </w:rPr>
-        <w:t xml:space="preserve">The matrix covers every VLAN 40 row with paired permit/deny proof, the four hosts carry baselines or config records with triaged scan findings, and inventory, register, and exception record all reflect the finished wave.</w:t>
+        <w:t xml:space="preserve">The matrix covers every VLAN 40 row with paired permit/deny proof, the four hosts carry baselines or config records with triaged scan findings, and inventory, register, and exception record all reflect the finished services.</w:t>
       </w:r>
     </w:p>
     <w:p>
@@ -6266,7 +6464,7 @@
                 <w:sz w:val="19"/>
                 <w:szCs w:val="19"/>
               </w:rPr>
-              <w:t xml:space="preserve">05  Reconcile, scan, and close the wave</w:t>
+              <w:t xml:space="preserve">05  Reconcile, scan, and hand off</w:t>
             </w:r>
           </w:p>
         </w:tc>
@@ -6560,7 +6758,7 @@
         <w:sz w:val="15"/>
         <w:szCs w:val="15"/>
       </w:rPr>
-      <w:t xml:space="preserve">© 2026 Secure By Design Team LLC.   Course 1.11 · Materials edition 1.0     </w:t>
+      <w:t xml:space="preserve">© 2026 Secure By Design Team LLC.   Course 1.11 · Materials edition 1.1     </w:t>
     </w:r>
     <w:r>
       <w:rPr>

</xml_diff>